<commit_message>
fix: update content and formatting in index files, remove unused figures
</commit_message>
<xml_diff>
--- a/index.docx
+++ b/index.docx
@@ -7,7 +7,7 @@
         <w:pStyle w:val="Title"/>
       </w:pPr>
       <w:r>
-        <w:t xml:space="preserve">Remote sensing of marine vegetation for monitoring and managing coastal ecosystems.</w:t>
+        <w:t xml:space="preserve">Remote sensing of marine vegetation for monitoring and managing coastal ecosystems</w:t>
       </w:r>
     </w:p>
     <w:p>
@@ -49,7 +49,7 @@
         <w:br w:type="page"/>
       </w:r>
     </w:p>
-    <w:bookmarkStart w:id="110" w:name="research-plan"/>
+    <w:bookmarkStart w:id="111" w:name="research-plan"/>
     <w:p>
       <w:pPr>
         <w:pStyle w:val="Heading2"/>
@@ -366,7 +366,7 @@
         <w:br/>
       </w:r>
       <w:r>
-        <w:t xml:space="preserve">Jordi Boada (CEAB-CSIC)</w:t>
+        <w:t xml:space="preserve">Jordi Boada</w:t>
       </w:r>
       <w:r>
         <w:t xml:space="preserve"> </w:t>
@@ -590,7 +590,7 @@
           <w:rPr>
             <w:rStyle w:val="Hyperlink"/>
           </w:rPr>
-          <w:t xml:space="preserve">AIC, Oviedo University</w:t>
+          <w:t xml:space="preserve">Artificial Intelligence Center, Oviedo University</w:t>
         </w:r>
       </w:hyperlink>
       <w:r>
@@ -1083,7 +1083,7 @@
         <w:pStyle w:val="FirstParagraph"/>
       </w:pPr>
       <w:r>
-        <w:t xml:space="preserve">Ocean environmental conditions are changing at unprecedented rates causing profound ecosystem transformations. These changes are especially important along the coast where intensifying human activity tends to concentrate. As a result, marine vegetated ecosystems are severely degrading and substantial areas of both seagrass meadows and macroalgal forests have already been lost. Since these are crucial foundation species fostering marine biodiversity and ecosystem functioning, important services to society are dissipating.</w:t>
+        <w:t xml:space="preserve">Ocean environmental conditions are changing at unprecedented rates, leading to profound transformations of marine ecosystems. These changes are especially important along the coast where intensifying human activity tends to concentrate. As a result, marine vegetated ecosystems are severely degrading and substantial areas of both seagrass meadows and macroalgal forests have already been lost. As key foundation species, their decline undermines marine biodiversity, ecosystem functioning, and the services they provide to society.</w:t>
       </w:r>
     </w:p>
     <w:p>
@@ -1119,7 +1119,7 @@
         </w:r>
       </w:hyperlink>
       <w:r>
-        <w:t xml:space="preserve">, aligned with the objectives of the Convention on Biological Diversity, which focus on improving biodiversity and ecosystem services, maintaining ecological integrity and connectivity, and strengthening genetic diversity. In addition, other European directives and international agreements—such as the Habitats Directive (92/43/EEC), the Barcelona Convention, and OSPAR—aim to protect coastal marine ecosystems through habitat conservation, biodiversity protection, and the reduction of anthropogenic pressures.</w:t>
+        <w:t xml:space="preserve">, aligned with the objectives of the Convention on Biological Diversity, which aims to improve biodiversity and ecosystem services, maintaining ecological integrity and connectivity, and strengthening genetic diversity. In addition, other European directives and international agreements—such as the Habitats Directive (92/43/EEC), the Barcelona Convention, and OSPAR—aim to protect coastal marine ecosystems through habitat conservation, biodiversity protection, and the reduction of anthropogenic pressures.</w:t>
       </w:r>
     </w:p>
     <w:p>
@@ -1127,7 +1127,7 @@
         <w:pStyle w:val="BodyText"/>
       </w:pPr>
       <w:r>
-        <w:t xml:space="preserve">Achieving these conservation goals requires robust, scientifically grounded methodologies for assessing the status of coastal ecosystems to guide decision making. A key component of these assessments is the ability to monitor habitat distribution periodically across multiple spatial scales, evaluating aspects such as range, extent, and the degree of fragmentation or connectivity. In this context, there is a clear trade-off between scale and accuracy. Traditional in situ distribution monitoring techniques provide high precision but are limited to small spatial scales. In contrast, the recent growth of remote sensing and geospatial data analysis offers considerable potential to address habitat distribution at broader scales.</w:t>
+        <w:t xml:space="preserve">Achieving these conservation goals requires robust, scientifically grounded methodologies for assessing the status of coastal ecosystems to guide evidence-based decision making. A key component of these assessments is the ability to monitor habitat distribution periodically across multiple spatial scales, evaluating aspects such as range, extent, and the degree of fragmentation or connectivity. In this context, there is a clear trade-off between scale and accuracy. Traditional in situ distribution monitoring techniques provide high precision but are limited to small spatial scales. In contrast, the recent growth of remote sensing (RS) and geospatial data analysis offers considerable potential to address habitat distribution at broader scales.</w:t>
       </w:r>
     </w:p>
     <w:p>
@@ -1141,7 +1141,7 @@
         <w:t xml:space="preserve"> </w:t>
       </w:r>
       <w:r>
-        <w:t xml:space="preserve">(McRoberts 2011)</w:t>
+        <w:t xml:space="preserve">Congalton (1991)</w:t>
       </w:r>
       <w:r>
         <w:t xml:space="preserve"> </w:t>
@@ -1156,7 +1156,7 @@
         <w:t xml:space="preserve">(Kilminster et al. 2015)</w:t>
       </w:r>
       <w:r>
-        <w:t xml:space="preserve">. Achieving this requires a balance between in situ and ex situ information, and between technical and ecological knowledge: two sine qua non conditions for remote sensing to contribute effectively to conservation status assessment and coastal management.</w:t>
+        <w:t xml:space="preserve">. Achieving this requires a balance between in situ and remotely sensed data, and between technical and ecological knowledge. These considerations are essential for remote sensing to contribute effectively to conservation status assessment and coastal management.</w:t>
       </w:r>
     </w:p>
     <w:p>
@@ -1203,7 +1203,7 @@
         <w:t xml:space="preserve">fine scale</w:t>
       </w:r>
       <w:r>
-        <w:t xml:space="preserve">, underwater and aerial drones will be used to produce high-resolution maps, enabling the study of habitat spatial configuration, fragmentation and conservation status. At the</w:t>
+        <w:t xml:space="preserve">, underwater and aerial drones will be used to produce high-resolution maps, enabling the study of habitat spatial configuration, fragmentation and ecological status. At the</w:t>
       </w:r>
       <w:r>
         <w:t xml:space="preserve"> </w:t>
@@ -1228,7 +1228,7 @@
           <wp:inline>
             <wp:extent cx="3733800" cy="2489200"/>
             <wp:effectExtent b="0" l="0" r="0" t="0"/>
-            <wp:docPr descr="Interaction of the different observing scales." title="" id="81" name="Picture"/>
+            <wp:docPr descr="Interaction between the different observation scales." title="" id="81" name="Picture"/>
             <a:graphic>
               <a:graphicData uri="http://schemas.openxmlformats.org/drawingml/2006/picture">
                 <pic:pic>
@@ -1271,7 +1271,7 @@
         <w:pStyle w:val="ImageCaption"/>
       </w:pPr>
       <w:r>
-        <w:t xml:space="preserve">Interaction of the different observing scales.</w:t>
+        <w:t xml:space="preserve">Interaction between the different observation scales.</w:t>
       </w:r>
     </w:p>
     <w:bookmarkEnd w:id="83"/>
@@ -1344,7 +1344,7 @@
         <w:t xml:space="preserve">(Fornes et al. 2006; Brando et al. 2009; Traganos and Reinartz 2018; Poursanidis et al. 2019; Traganos et al. 2022)</w:t>
       </w:r>
       <w:r>
-        <w:t xml:space="preserve">. I personally developed my Master’s thesis</w:t>
+        <w:t xml:space="preserve">. Within this context, I developed my Master’s thesis</w:t>
       </w:r>
       <w:r>
         <w:t xml:space="preserve"> </w:t>
@@ -1370,7 +1370,7 @@
         </w:r>
       </w:hyperlink>
       <w:r>
-        <w:t xml:space="preserve">, which, in 2021, was a pioneer work using Sentinel-2 in the Balearic Archipelago.</w:t>
+        <w:t xml:space="preserve">, which, in 2021, constitued a pioneering application of Sentinel-2 imagery in the Balearic Archipelago.</w:t>
       </w:r>
     </w:p>
     <w:p>
@@ -1493,7 +1493,7 @@
         <w:t xml:space="preserve"> </w:t>
       </w:r>
       <w:r>
-        <w:t xml:space="preserve">is restricted to the optically shallow waters, defined as regions where the bottom exerts a measurable influence on the water-leaving reflectance. Optically shallow waters are dependent on the bathymetry and the varying optical properties of both the water column and the benthos. Some of these limitations could be overcame through the use of</w:t>
+        <w:t xml:space="preserve">is restricted to the optically shallow waters, defined as regions where the bottom exerts a measurable influence on the water-leaving reflectance. Optically shallow waters are dependent on the bathymetry and the varying optical properties of both the water column and the benthos. Some of these limitations can be partially overcame through the use of</w:t>
       </w:r>
       <w:r>
         <w:t xml:space="preserve"> </w:t>
@@ -1650,11 +1650,11 @@
         <w:t xml:space="preserve"> </w:t>
       </w:r>
       <w:r>
-        <w:t xml:space="preserve">allows the complementary strengths of both platforms to be exploited, balancing drone spatial detail with satellite spatial coverage.</w:t>
+        <w:t xml:space="preserve">allows the complementary strengths of both platforms to be exploited, balancing the fine spatial detail provided by drones with the broader spatial and temporal coverage offered by satellites.</w:t>
       </w:r>
     </w:p>
     <w:bookmarkEnd w:id="92"/>
-    <w:bookmarkStart w:id="98" w:name="objectives"/>
+    <w:bookmarkStart w:id="99" w:name="objectives"/>
     <w:p>
       <w:pPr>
         <w:pStyle w:val="Heading3"/>
@@ -1669,7 +1669,7 @@
         <w:pStyle w:val="Heading4"/>
       </w:pPr>
       <w:r>
-        <w:t xml:space="preserve">Main phd objective:</w:t>
+        <w:t xml:space="preserve">Main phd objective</w:t>
       </w:r>
     </w:p>
     <w:p>
@@ -1685,13 +1685,38 @@
       </w:r>
     </w:p>
     <w:bookmarkEnd w:id="93"/>
-    <w:bookmarkStart w:id="94" w:name="specific-objective-1-fine-scale-subtidal"/>
+    <w:bookmarkStart w:id="98" w:name="specific-objectives"/>
     <w:p>
       <w:pPr>
         <w:pStyle w:val="Heading4"/>
       </w:pPr>
       <w:r>
-        <w:t xml:space="preserve">Specific objective 1: fine scale subtidal</w:t>
+        <w:t xml:space="preserve">Specific objectives</w:t>
+      </w:r>
+    </w:p>
+    <w:bookmarkStart w:id="94" w:name="X66b6dc76da2ebf5d9fb50465c87a2b54925bd76"/>
+    <w:p>
+      <w:pPr>
+        <w:pStyle w:val="Heading5"/>
+      </w:pPr>
+      <w:r>
+        <w:t xml:space="preserve">Fine scale I: monitoring</w:t>
+      </w:r>
+      <w:r>
+        <w:t xml:space="preserve"> </w:t>
+      </w:r>
+      <w:r>
+        <w:rPr>
+          <w:i/>
+          <w:iCs/>
+        </w:rPr>
+        <w:t xml:space="preserve">P. oceanica</w:t>
+      </w:r>
+      <w:r>
+        <w:t xml:space="preserve"> </w:t>
+      </w:r>
+      <w:r>
+        <w:t xml:space="preserve">deep limits and landscape metrics as ecological indicators</w:t>
       </w:r>
     </w:p>
     <w:p>
@@ -1712,7 +1737,7 @@
         <w:t xml:space="preserve">autonomous underwater vehicles</w:t>
       </w:r>
       <w:r>
-        <w:t xml:space="preserve">, and advanced image analysis to overcome traditional limitations in</w:t>
+        <w:t xml:space="preserve">, and advanced image analysis to overcome traditional limitations in monitoring the deep limit of</w:t>
       </w:r>
       <w:r>
         <w:t xml:space="preserve"> </w:t>
@@ -1725,10 +1750,7 @@
         <w:t xml:space="preserve">P. oceanica</w:t>
       </w:r>
       <w:r>
-        <w:t xml:space="preserve"> </w:t>
-      </w:r>
-      <w:r>
-        <w:t xml:space="preserve">deep-limit monitoring. Generating ultra-high resolution maps of the deep limits will allow for higher spatial precision, enabling the incorporation of landscape analysis to asses the structure and spatial configuration of the meadow limits. These seascape metrics offer a novel and promising perspective for assessing the condition of</w:t>
+        <w:t xml:space="preserve">. Generating ultra-high resolution maps of the deep limits will allow for higher spatial precision, enabling the incorporation of landscape analysis to asses the structure and spatial configuration of the meadow limits. These seascape metrics offer a novel and promising perspective for assessing the ecological status of</w:t>
       </w:r>
       <w:r>
         <w:t xml:space="preserve"> </w:t>
@@ -1748,13 +1770,13 @@
       </w:r>
     </w:p>
     <w:bookmarkEnd w:id="94"/>
-    <w:bookmarkStart w:id="95" w:name="specific-objective-2-fine-scale-subtidal"/>
-    <w:p>
-      <w:pPr>
-        <w:pStyle w:val="Heading4"/>
-      </w:pPr>
-      <w:r>
-        <w:t xml:space="preserve">Specific objective 2: fine scale subtidal</w:t>
+    <w:bookmarkStart w:id="95" w:name="X24babf5d15252b80ea083419d56cfe9b9c29726"/>
+    <w:p>
+      <w:pPr>
+        <w:pStyle w:val="Heading5"/>
+      </w:pPr>
+      <w:r>
+        <w:t xml:space="preserve">Fine scale II: monitoring sea urchin barren evolution in relation to fishing effort</w:t>
       </w:r>
     </w:p>
     <w:p>
@@ -1804,17 +1826,17 @@
         <w:t xml:space="preserve">A. lixula</w:t>
       </w:r>
       <w:r>
-        <w:t xml:space="preserve">. Analyze temporal dynamics of barren expansion and contraction in relation to sea urchin harvesting.</w:t>
+        <w:t xml:space="preserve">. Analyze temporal dynamics of barren expansion and contraction in relation to sea urchin harvesting pressure.</w:t>
       </w:r>
     </w:p>
     <w:bookmarkEnd w:id="95"/>
-    <w:bookmarkStart w:id="96" w:name="X9f3643b78f2f6405f860a5744eb3de10c26c9a1"/>
-    <w:p>
-      <w:pPr>
-        <w:pStyle w:val="Heading4"/>
-      </w:pPr>
-      <w:r>
-        <w:t xml:space="preserve">Specific objective 3: broad scale subtidal</w:t>
+    <w:bookmarkStart w:id="96" w:name="X0d91001acf99a0fe97805d356ba8d4fcbacd301"/>
+    <w:p>
+      <w:pPr>
+        <w:pStyle w:val="Heading5"/>
+      </w:pPr>
+      <w:r>
+        <w:t xml:space="preserve">Broad scale I: mapping subtidal marine vegetation with Sentinel-2</w:t>
       </w:r>
     </w:p>
     <w:p>
@@ -1838,26 +1860,17 @@
         <w:t xml:space="preserve"> </w:t>
       </w:r>
       <w:r>
-        <w:t xml:space="preserve">to design a scalable and reproducible Python processing workflow to map underwater vegetation in Special Areas of Conservation (SAC) as defined by the Habitat Directive. Assess the spectral separability of different species and bottom types across different bioregions and develop a robust accuracy assessment methodology that can be applied to these RS-derived cartographies and other mapping products. Temporal trends in habitat distribution will also be analyzed for dynamic seagrass species</w:t>
-      </w:r>
-      <w:r>
-        <w:t xml:space="preserve"> </w:t>
-      </w:r>
-      <w:r>
-        <w:t xml:space="preserve">(Kilminster et al. 2015)</w:t>
-      </w:r>
-      <w:r>
-        <w:t xml:space="preserve">.</w:t>
+        <w:t xml:space="preserve">to design a scalable and reproducible Python processing workflow to map underwater vegetation in Special Areas of Conservation (SAC) as defined by the Habitat Directive. Assess the spectral separability of different species and bottom types across bioregions and leverage high quality field validation data to develop a rigorous accuracy assessment methodology that can be applied to these RS-derived cartographies and other mapping products. Temporal trends in habitat distribution will also be analyzed for dynamic seagrass species.</w:t>
       </w:r>
     </w:p>
     <w:bookmarkEnd w:id="96"/>
-    <w:bookmarkStart w:id="97" w:name="Xf564eaf0d8d9c1c0cefa263d64da5f0bbe80640"/>
-    <w:p>
-      <w:pPr>
-        <w:pStyle w:val="Heading4"/>
-      </w:pPr>
-      <w:r>
-        <w:t xml:space="preserve">Specific objective 4: broad scale intertidal</w:t>
+    <w:bookmarkStart w:id="97" w:name="Xebe60fcd5718e2f5a222a97d69fd72d2e8de11a"/>
+    <w:p>
+      <w:pPr>
+        <w:pStyle w:val="Heading5"/>
+      </w:pPr>
+      <w:r>
+        <w:t xml:space="preserve">Broad scale II: mapping intertidal seagrass meadows with Sentinel-2 and in situ data.</w:t>
       </w:r>
     </w:p>
     <w:p>
@@ -1902,7 +1915,8 @@
     </w:p>
     <w:bookmarkEnd w:id="97"/>
     <w:bookmarkEnd w:id="98"/>
-    <w:bookmarkStart w:id="102" w:name="methodology"/>
+    <w:bookmarkEnd w:id="99"/>
+    <w:bookmarkStart w:id="103" w:name="methodology"/>
     <w:p>
       <w:pPr>
         <w:pStyle w:val="Heading3"/>
@@ -1942,7 +1956,7 @@
           <w:b/>
           <w:bCs/>
         </w:rPr>
-        <w:t xml:space="preserve">with high quality field data</w:t>
+        <w:t xml:space="preserve">with high-quality field data</w:t>
       </w:r>
       <w:r>
         <w:t xml:space="preserve">. Ultra-high-resolution imagery obtained from autonomous underwater vehicles (AUVs) and aerial drones is first processed using photogrammetric workflows to generate georeferenced orthomosaics and three-dimensional products of the seabed and intertidal zones. These datasets provide detailed information on habitat structure and are used both for fine-scale mapping and as reference data for model calibration and validation. At broader scales, satellite imagery is processed through standardized pre-processing steps, including atmospheric and water-column corrections. Spectral, textural, and contextual features are then extracted from all platforms and harmonized within a common geospatial framework. Habitat mapping is performed using a combination of empirical classification approaches, physics-based models, and machine-learning techniques, producing probabilistic raster outputs that represent class membership or habitat probability. Finally, these probabilistic products are thresholded and post-processed to generate categorical habitat maps, whose accuracy and uncertainty are assessed using</w:t>
@@ -1986,18 +2000,18 @@
           <wp:inline>
             <wp:extent cx="4800600" cy="2358111"/>
             <wp:effectExtent b="0" l="0" r="0" t="0"/>
-            <wp:docPr descr="General workflow illustrating the transformation of imagery and ancillary variables within a datacube into probabilistic rasters and final categorical maps" title="" id="100" name="Picture"/>
+            <wp:docPr descr="General workflow illustrating the transformation of imagery and ancillary variables within a datacube into probabilistic rasters and final categorical maps" title="" id="101" name="Picture"/>
             <a:graphic>
               <a:graphicData uri="http://schemas.openxmlformats.org/drawingml/2006/picture">
                 <pic:pic>
                   <pic:nvPicPr>
-                    <pic:cNvPr descr="assets/img/img3.png" id="101" name="Picture"/>
+                    <pic:cNvPr descr="assets/img/img3.png" id="102" name="Picture"/>
                     <pic:cNvPicPr>
                       <a:picLocks noChangeArrowheads="1" noChangeAspect="1"/>
                     </pic:cNvPicPr>
                   </pic:nvPicPr>
                   <pic:blipFill>
-                    <a:blip r:embed="rId99"/>
+                    <a:blip r:embed="rId100"/>
                     <a:stretch>
                       <a:fillRect/>
                     </a:stretch>
@@ -2032,8 +2046,8 @@
         <w:t xml:space="preserve">General workflow illustrating the transformation of imagery and ancillary variables within a datacube into probabilistic rasters and final categorical maps</w:t>
       </w:r>
     </w:p>
-    <w:bookmarkEnd w:id="102"/>
-    <w:bookmarkStart w:id="105" w:name="data-management-plan"/>
+    <w:bookmarkEnd w:id="103"/>
+    <w:bookmarkStart w:id="106" w:name="data-management-plan"/>
     <w:p>
       <w:pPr>
         <w:pStyle w:val="Heading3"/>
@@ -2042,7 +2056,7 @@
         <w:t xml:space="preserve">Data management plan</w:t>
       </w:r>
     </w:p>
-    <w:bookmarkStart w:id="103" w:name="general-considerations"/>
+    <w:bookmarkStart w:id="104" w:name="general-considerations"/>
     <w:p>
       <w:pPr>
         <w:pStyle w:val="Heading4"/>
@@ -2096,8 +2110,8 @@
         <w:t xml:space="preserve">The research will integrate heterogeneous datasets including (i) long-term field observations (e.g. presence/absence, cover, depth limits, structural descriptors), (ii) ultra-high-resolution imagery derived from AUV and aerial drone surveys, and (iii) satellite-based remote sensing products. Newly generated datasets (orthomosaics, derived indices, probabilistic rasters, categorical habitat maps, and accuracy assessment outputs) will be produced following standardized and reproducible processing workflows, generating high-value datasets for coastal ecosystem monitoring, trend analysis, and future conservation efforts.</w:t>
       </w:r>
     </w:p>
-    <w:bookmarkEnd w:id="103"/>
-    <w:bookmarkStart w:id="104" w:name="fair-principles"/>
+    <w:bookmarkEnd w:id="104"/>
+    <w:bookmarkStart w:id="105" w:name="fair-principles"/>
     <w:p>
       <w:pPr>
         <w:pStyle w:val="Heading4"/>
@@ -2217,9 +2231,9 @@
         <w:t xml:space="preserve">Documentation will include data dictionaries, methodology, and quality-control procedures. Open licenses (CC BY/CC BY-NC) will facilitate reuse for monitoring, validation, and conservation planning.</w:t>
       </w:r>
     </w:p>
-    <w:bookmarkEnd w:id="104"/>
     <w:bookmarkEnd w:id="105"/>
-    <w:bookmarkStart w:id="109" w:name="timeline"/>
+    <w:bookmarkEnd w:id="106"/>
+    <w:bookmarkStart w:id="110" w:name="timeline"/>
     <w:p>
       <w:pPr>
         <w:pStyle w:val="Heading3"/>
@@ -2250,18 +2264,18 @@
           <wp:inline>
             <wp:extent cx="5334000" cy="2103159"/>
             <wp:effectExtent b="0" l="0" r="0" t="0"/>
-            <wp:docPr descr="" title="" id="107" name="Picture"/>
+            <wp:docPr descr="" title="" id="108" name="Picture"/>
             <a:graphic>
               <a:graphicData uri="http://schemas.openxmlformats.org/drawingml/2006/picture">
                 <pic:pic>
                   <pic:nvPicPr>
-                    <pic:cNvPr descr="index_files/figure-docx/mermaid-figure-1.png" id="108" name="Picture"/>
+                    <pic:cNvPr descr="index_files/figure-docx/mermaid-figure-1.png" id="109" name="Picture"/>
                     <pic:cNvPicPr>
                       <a:picLocks noChangeArrowheads="1" noChangeAspect="1"/>
                     </pic:cNvPicPr>
                   </pic:nvPicPr>
                   <pic:blipFill>
-                    <a:blip r:embed="rId106"/>
+                    <a:blip r:embed="rId107"/>
                     <a:stretch>
                       <a:fillRect/>
                     </a:stretch>
@@ -2293,9 +2307,9 @@
         <w:pStyle w:val="BodyText"/>
       </w:pPr>
     </w:p>
-    <w:bookmarkEnd w:id="109"/>
     <w:bookmarkEnd w:id="110"/>
-    <w:bookmarkStart w:id="123" w:name="researcher-development-plan"/>
+    <w:bookmarkEnd w:id="111"/>
+    <w:bookmarkStart w:id="124" w:name="researcher-development-plan"/>
     <w:p>
       <w:pPr>
         <w:pStyle w:val="Heading2"/>
@@ -2304,7 +2318,7 @@
         <w:t xml:space="preserve">Researcher development plan</w:t>
       </w:r>
     </w:p>
-    <w:bookmarkStart w:id="112" w:name="training-courses"/>
+    <w:bookmarkStart w:id="113" w:name="training-courses"/>
     <w:p>
       <w:pPr>
         <w:pStyle w:val="Heading4"/>
@@ -2348,9 +2362,6 @@
       <w:r>
         <w:t xml:space="preserve">Experimental design and sampling, Girona University (1 ECTS)</w:t>
       </w:r>
-      <w:r>
-        <w:br/>
-      </w:r>
     </w:p>
     <w:p>
       <w:pPr>
@@ -2360,7 +2371,7 @@
           <w:numId w:val="1002"/>
         </w:numPr>
       </w:pPr>
-      <w:hyperlink r:id="rId111">
+      <w:hyperlink r:id="rId112">
         <w:r>
           <w:rPr>
             <w:rStyle w:val="Hyperlink"/>
@@ -2369,8 +2380,8 @@
         </w:r>
       </w:hyperlink>
     </w:p>
-    <w:bookmarkEnd w:id="112"/>
-    <w:bookmarkStart w:id="113" w:name="research-stays"/>
+    <w:bookmarkEnd w:id="113"/>
+    <w:bookmarkStart w:id="114" w:name="research-stays"/>
     <w:p>
       <w:pPr>
         <w:pStyle w:val="Heading4"/>
@@ -2391,8 +2402,8 @@
         <w:t xml:space="preserve">Erasmus Mobility: A 6-month research stay at an international partner institution is planned during the first year, ideally coinciding with methodology development and remote sensing analysis. This will allow exposure to complementary methodologies, strengthen collaborations, and expand the research network.</w:t>
       </w:r>
     </w:p>
-    <w:bookmarkEnd w:id="113"/>
-    <w:bookmarkStart w:id="114" w:name="participation-as-attendee"/>
+    <w:bookmarkEnd w:id="114"/>
+    <w:bookmarkStart w:id="115" w:name="participation-as-attendee"/>
     <w:p>
       <w:pPr>
         <w:pStyle w:val="Heading4"/>
@@ -2425,8 +2436,8 @@
         <w:t xml:space="preserve">Coordination meetings with public institutions.</w:t>
       </w:r>
     </w:p>
-    <w:bookmarkEnd w:id="114"/>
-    <w:bookmarkStart w:id="119" w:name="participation-as-speaker"/>
+    <w:bookmarkEnd w:id="115"/>
+    <w:bookmarkStart w:id="120" w:name="participation-as-speaker"/>
     <w:p>
       <w:pPr>
         <w:pStyle w:val="Heading4"/>
@@ -2467,7 +2478,7 @@
           <w:numId w:val="1006"/>
         </w:numPr>
       </w:pPr>
-      <w:hyperlink r:id="rId115">
+      <w:hyperlink r:id="rId116">
         <w:r>
           <w:rPr>
             <w:rStyle w:val="Hyperlink"/>
@@ -2475,9 +2486,6 @@
           <w:t xml:space="preserve">21st Congress of the Spanish Remote Sensing Association</w:t>
         </w:r>
       </w:hyperlink>
-      <w:r>
-        <w:br/>
-      </w:r>
     </w:p>
     <w:p>
       <w:pPr>
@@ -2487,7 +2495,7 @@
           <w:numId w:val="1006"/>
         </w:numPr>
       </w:pPr>
-      <w:hyperlink r:id="rId116">
+      <w:hyperlink r:id="rId117">
         <w:r>
           <w:rPr>
             <w:rStyle w:val="Hyperlink"/>
@@ -2495,9 +2503,6 @@
           <w:t xml:space="preserve">Geopython</w:t>
         </w:r>
       </w:hyperlink>
-      <w:r>
-        <w:br/>
-      </w:r>
     </w:p>
     <w:p>
       <w:pPr>
@@ -2507,7 +2512,7 @@
           <w:numId w:val="1006"/>
         </w:numPr>
       </w:pPr>
-      <w:hyperlink r:id="rId117">
+      <w:hyperlink r:id="rId118">
         <w:r>
           <w:rPr>
             <w:rStyle w:val="Hyperlink"/>
@@ -2524,7 +2529,7 @@
           <w:numId w:val="1006"/>
         </w:numPr>
       </w:pPr>
-      <w:hyperlink r:id="rId118">
+      <w:hyperlink r:id="rId119">
         <w:r>
           <w:rPr>
             <w:rStyle w:val="Hyperlink"/>
@@ -2533,8 +2538,8 @@
         </w:r>
       </w:hyperlink>
     </w:p>
-    <w:bookmarkEnd w:id="119"/>
-    <w:bookmarkStart w:id="120" w:name="X475f27f0368c34cb6df26e63a7ca21025be1c1d"/>
+    <w:bookmarkEnd w:id="120"/>
+    <w:bookmarkStart w:id="121" w:name="X475f27f0368c34cb6df26e63a7ca21025be1c1d"/>
     <w:p>
       <w:pPr>
         <w:pStyle w:val="Heading4"/>
@@ -2592,8 +2597,8 @@
         <w:t xml:space="preserve">Science week, Oceanographic Center of Gijón (2026, 2027, 2028)</w:t>
       </w:r>
     </w:p>
-    <w:bookmarkEnd w:id="120"/>
-    <w:bookmarkStart w:id="121" w:name="scientific-publications"/>
+    <w:bookmarkEnd w:id="121"/>
+    <w:bookmarkStart w:id="122" w:name="scientific-publications"/>
     <w:p>
       <w:pPr>
         <w:pStyle w:val="Heading4"/>
@@ -2718,13 +2723,8 @@
         <w:t xml:space="preserve">compilation of publications</w:t>
       </w:r>
     </w:p>
-    <w:p>
-      <w:r>
-        <w:br w:type="page"/>
-      </w:r>
-    </w:p>
-    <w:bookmarkEnd w:id="121"/>
-    <w:bookmarkStart w:id="122" w:name="training-planning"/>
+    <w:bookmarkEnd w:id="122"/>
+    <w:bookmarkStart w:id="123" w:name="training-planning"/>
     <w:p>
       <w:pPr>
         <w:pStyle w:val="Heading4"/>
@@ -2844,9 +2844,9 @@
         </w:tc>
       </w:tr>
     </w:tbl>
-    <w:bookmarkEnd w:id="122"/>
     <w:bookmarkEnd w:id="123"/>
-    <w:bookmarkStart w:id="157" w:name="bibliography"/>
+    <w:bookmarkEnd w:id="124"/>
+    <w:bookmarkStart w:id="164" w:name="bibliography"/>
     <w:p>
       <w:pPr>
         <w:pStyle w:val="Heading2"/>
@@ -2855,8 +2855,8 @@
         <w:t xml:space="preserve">Bibliography</w:t>
       </w:r>
     </w:p>
-    <w:bookmarkStart w:id="156" w:name="refs"/>
-    <w:bookmarkStart w:id="125" w:name="ref-brando_physics_2009"/>
+    <w:bookmarkStart w:id="163" w:name="refs"/>
+    <w:bookmarkStart w:id="126" w:name="ref-brando_physics_2009"/>
     <w:p>
       <w:pPr>
         <w:pStyle w:val="Bibliography"/>
@@ -2889,7 +2889,7 @@
       <w:r>
         <w:t xml:space="preserve"> </w:t>
       </w:r>
-      <w:hyperlink r:id="rId124">
+      <w:hyperlink r:id="rId125">
         <w:r>
           <w:rPr>
             <w:rStyle w:val="Hyperlink"/>
@@ -2901,8 +2901,8 @@
         <w:t xml:space="preserve">.</w:t>
       </w:r>
     </w:p>
-    <w:bookmarkEnd w:id="125"/>
-    <w:bookmarkStart w:id="127" w:name="ref-calleja_2017"/>
+    <w:bookmarkEnd w:id="126"/>
+    <w:bookmarkStart w:id="128" w:name="ref-calleja_2017"/>
     <w:p>
       <w:pPr>
         <w:pStyle w:val="Bibliography"/>
@@ -2959,7 +2959,7 @@
       <w:r>
         <w:t xml:space="preserve"> </w:t>
       </w:r>
-      <w:hyperlink r:id="rId126">
+      <w:hyperlink r:id="rId127">
         <w:r>
           <w:rPr>
             <w:rStyle w:val="Hyperlink"/>
@@ -2971,20 +2971,20 @@
         <w:t xml:space="preserve">.</w:t>
       </w:r>
     </w:p>
-    <w:bookmarkEnd w:id="127"/>
-    <w:bookmarkStart w:id="129" w:name="ref-davies_multi_2023"/>
+    <w:bookmarkEnd w:id="128"/>
+    <w:bookmarkStart w:id="130" w:name="ref-congalton_1991"/>
     <w:p>
       <w:pPr>
         <w:pStyle w:val="Bibliography"/>
       </w:pPr>
       <w:r>
-        <w:t xml:space="preserve">Davies, Bede Ffinian Rowe, Pierre Gernez, Andréa Geraud, Simon Oiry, Philippe Rosa, Maria Laura Zoffoli, and Laurent Barillé. 2023.</w:t>
-      </w:r>
-      <w:r>
-        <w:t xml:space="preserve"> </w:t>
-      </w:r>
-      <w:r>
-        <w:t xml:space="preserve">“Multi- and Hyperspectral Classification of Soft-Bottom Intertidal Vegetation Using a Spectral Library for Coastal Biodiversity Remote Sensing.”</w:t>
+        <w:t xml:space="preserve">Congalton, Russell G. 1991.</w:t>
+      </w:r>
+      <w:r>
+        <w:t xml:space="preserve"> </w:t>
+      </w:r>
+      <w:r>
+        <w:t xml:space="preserve">“A Review of Assessing the Accuracy of Classifications of Remotely Sensed Data.”</w:t>
       </w:r>
       <w:r>
         <w:t xml:space="preserve"> </w:t>
@@ -3000,12 +3000,58 @@
         <w:t xml:space="preserve"> </w:t>
       </w:r>
       <w:r>
+        <w:t xml:space="preserve">37 (1): 35–46.</w:t>
+      </w:r>
+      <w:r>
+        <w:t xml:space="preserve"> </w:t>
+      </w:r>
+      <w:hyperlink r:id="rId129">
+        <w:r>
+          <w:rPr>
+            <w:rStyle w:val="Hyperlink"/>
+          </w:rPr>
+          <w:t xml:space="preserve">https://doi.org/10.1016/0034-4257(91)90048-B</w:t>
+        </w:r>
+      </w:hyperlink>
+      <w:r>
+        <w:t xml:space="preserve">.</w:t>
+      </w:r>
+    </w:p>
+    <w:bookmarkEnd w:id="130"/>
+    <w:bookmarkStart w:id="132" w:name="ref-davies_multi_2023"/>
+    <w:p>
+      <w:pPr>
+        <w:pStyle w:val="Bibliography"/>
+      </w:pPr>
+      <w:r>
+        <w:t xml:space="preserve">Davies, Bede Ffinian Rowe, Pierre Gernez, Andréa Geraud, Simon Oiry, Philippe Rosa, Maria Laura Zoffoli, and Laurent Barillé. 2023.</w:t>
+      </w:r>
+      <w:r>
+        <w:t xml:space="preserve"> </w:t>
+      </w:r>
+      <w:r>
+        <w:t xml:space="preserve">“Multi- and Hyperspectral Classification of Soft-Bottom Intertidal Vegetation Using a Spectral Library for Coastal Biodiversity Remote Sensing.”</w:t>
+      </w:r>
+      <w:r>
+        <w:t xml:space="preserve"> </w:t>
+      </w:r>
+      <w:r>
+        <w:rPr>
+          <w:i/>
+          <w:iCs/>
+        </w:rPr>
+        <w:t xml:space="preserve">Remote Sensing of Environment</w:t>
+      </w:r>
+      <w:r>
+        <w:t xml:space="preserve"> </w:t>
+      </w:r>
+      <w:r>
         <w:t xml:space="preserve">290 (May): 113554.</w:t>
       </w:r>
       <w:r>
         <w:t xml:space="preserve"> </w:t>
       </w:r>
-      <w:hyperlink r:id="rId128">
+      <w:hyperlink r:id="rId131">
         <w:r>
           <w:rPr>
             <w:rStyle w:val="Hyperlink"/>
@@ -3017,8 +3063,8 @@
         <w:t xml:space="preserve">.</w:t>
       </w:r>
     </w:p>
-    <w:bookmarkEnd w:id="129"/>
-    <w:bookmarkStart w:id="131" w:name="ref-davies_initial_2026"/>
+    <w:bookmarkEnd w:id="132"/>
+    <w:bookmarkStart w:id="134" w:name="ref-davies_initial_2026"/>
     <w:p>
       <w:pPr>
         <w:pStyle w:val="Bibliography"/>
@@ -3063,7 +3109,7 @@
       <w:r>
         <w:t xml:space="preserve"> </w:t>
       </w:r>
-      <w:hyperlink r:id="rId130">
+      <w:hyperlink r:id="rId133">
         <w:r>
           <w:rPr>
             <w:rStyle w:val="Hyperlink"/>
@@ -3075,8 +3121,8 @@
         <w:t xml:space="preserve">.</w:t>
       </w:r>
     </w:p>
-    <w:bookmarkEnd w:id="131"/>
-    <w:bookmarkStart w:id="133" w:name="ref-davies_sentinel_2024"/>
+    <w:bookmarkEnd w:id="134"/>
+    <w:bookmarkStart w:id="136" w:name="ref-davies_sentinel_2024"/>
     <w:p>
       <w:pPr>
         <w:pStyle w:val="Bibliography"/>
@@ -3142,7 +3188,7 @@
       <w:r>
         <w:t xml:space="preserve"> </w:t>
       </w:r>
-      <w:hyperlink r:id="rId132">
+      <w:hyperlink r:id="rId135">
         <w:r>
           <w:rPr>
             <w:rStyle w:val="Hyperlink"/>
@@ -3154,8 +3200,8 @@
         <w:t xml:space="preserve">.</w:t>
       </w:r>
     </w:p>
-    <w:bookmarkEnd w:id="133"/>
-    <w:bookmarkStart w:id="135" w:name="ref-davies_intertidal_2024"/>
+    <w:bookmarkEnd w:id="136"/>
+    <w:bookmarkStart w:id="138" w:name="ref-davies_intertidal_2024"/>
     <w:p>
       <w:pPr>
         <w:pStyle w:val="Bibliography"/>
@@ -3212,7 +3258,7 @@
       <w:r>
         <w:t xml:space="preserve"> </w:t>
       </w:r>
-      <w:hyperlink r:id="rId134">
+      <w:hyperlink r:id="rId137">
         <w:r>
           <w:rPr>
             <w:rStyle w:val="Hyperlink"/>
@@ -3224,41 +3270,20 @@
         <w:t xml:space="preserve">.</w:t>
       </w:r>
     </w:p>
-    <w:bookmarkEnd w:id="135"/>
-    <w:bookmarkStart w:id="137" w:name="ref-fornes_mapping_2006"/>
+    <w:bookmarkEnd w:id="138"/>
+    <w:bookmarkStart w:id="140" w:name="ref-foody_status_2002"/>
     <w:p>
       <w:pPr>
         <w:pStyle w:val="Bibliography"/>
       </w:pPr>
       <w:r>
-        <w:t xml:space="preserve">Fornes, A., G. Basterretxea, A. Orfila, A. Jordi, A. Alvarez, and J. Tintore. 2006.</w:t>
-      </w:r>
-      <w:r>
-        <w:t xml:space="preserve"> </w:t>
-      </w:r>
-      <w:r>
-        <w:t xml:space="preserve">“Mapping</w:t>
-      </w:r>
-      <w:r>
-        <w:t xml:space="preserve"> </w:t>
-      </w:r>
-      <w:r>
-        <w:t xml:space="preserve">Posidonia</w:t>
-      </w:r>
-      <w:r>
-        <w:t xml:space="preserve"> </w:t>
-      </w:r>
-      <w:r>
-        <w:t xml:space="preserve">Oceanica from</w:t>
-      </w:r>
-      <w:r>
-        <w:t xml:space="preserve"> </w:t>
-      </w:r>
-      <w:r>
-        <w:t xml:space="preserve">IKONOS</w:t>
-      </w:r>
-      <w:r>
-        <w:t xml:space="preserve">.”</w:t>
+        <w:t xml:space="preserve">Foody, Giles M. 2002.</w:t>
+      </w:r>
+      <w:r>
+        <w:t xml:space="preserve"> </w:t>
+      </w:r>
+      <w:r>
+        <w:t xml:space="preserve">“Status of Land Cover Classification Accuracy Assessment.”</w:t>
       </w:r>
       <w:r>
         <w:t xml:space="preserve"> </w:t>
@@ -3268,6 +3293,73 @@
           <w:i/>
           <w:iCs/>
         </w:rPr>
+        <w:t xml:space="preserve">Remote Sensing of Environment</w:t>
+      </w:r>
+      <w:r>
+        <w:t xml:space="preserve"> </w:t>
+      </w:r>
+      <w:r>
+        <w:t xml:space="preserve">80 (1): 185–201.</w:t>
+      </w:r>
+      <w:r>
+        <w:t xml:space="preserve"> </w:t>
+      </w:r>
+      <w:hyperlink r:id="rId139">
+        <w:r>
+          <w:rPr>
+            <w:rStyle w:val="Hyperlink"/>
+          </w:rPr>
+          <w:t xml:space="preserve">https://doi.org/10.1016/S0034-4257(01)00295-4</w:t>
+        </w:r>
+      </w:hyperlink>
+      <w:r>
+        <w:t xml:space="preserve">.</w:t>
+      </w:r>
+    </w:p>
+    <w:bookmarkEnd w:id="140"/>
+    <w:bookmarkStart w:id="142" w:name="ref-fornes_mapping_2006"/>
+    <w:p>
+      <w:pPr>
+        <w:pStyle w:val="Bibliography"/>
+      </w:pPr>
+      <w:r>
+        <w:t xml:space="preserve">Fornes, A., G. Basterretxea, A. Orfila, A. Jordi, A. Alvarez, and J. Tintore. 2006.</w:t>
+      </w:r>
+      <w:r>
+        <w:t xml:space="preserve"> </w:t>
+      </w:r>
+      <w:r>
+        <w:t xml:space="preserve">“Mapping</w:t>
+      </w:r>
+      <w:r>
+        <w:t xml:space="preserve"> </w:t>
+      </w:r>
+      <w:r>
+        <w:t xml:space="preserve">Posidonia</w:t>
+      </w:r>
+      <w:r>
+        <w:t xml:space="preserve"> </w:t>
+      </w:r>
+      <w:r>
+        <w:t xml:space="preserve">Oceanica from</w:t>
+      </w:r>
+      <w:r>
+        <w:t xml:space="preserve"> </w:t>
+      </w:r>
+      <w:r>
+        <w:t xml:space="preserve">IKONOS</w:t>
+      </w:r>
+      <w:r>
+        <w:t xml:space="preserve">.”</w:t>
+      </w:r>
+      <w:r>
+        <w:t xml:space="preserve"> </w:t>
+      </w:r>
+      <w:r>
+        <w:rPr>
+          <w:i/>
+          <w:iCs/>
+        </w:rPr>
         <w:t xml:space="preserve">ISPRS Journal of Photogrammetry and Remote Sensing</w:t>
       </w:r>
       <w:r>
@@ -3279,7 +3371,7 @@
       <w:r>
         <w:t xml:space="preserve"> </w:t>
       </w:r>
-      <w:hyperlink r:id="rId136">
+      <w:hyperlink r:id="rId141">
         <w:r>
           <w:rPr>
             <w:rStyle w:val="Hyperlink"/>
@@ -3291,8 +3383,8 @@
         <w:t xml:space="preserve">.</w:t>
       </w:r>
     </w:p>
-    <w:bookmarkEnd w:id="137"/>
-    <w:bookmarkStart w:id="139" w:name="ref-kilminster_2015"/>
+    <w:bookmarkEnd w:id="142"/>
+    <w:bookmarkStart w:id="144" w:name="ref-kilminster_2015"/>
     <w:p>
       <w:pPr>
         <w:pStyle w:val="Bibliography"/>
@@ -3337,7 +3429,7 @@
       <w:r>
         <w:t xml:space="preserve"> </w:t>
       </w:r>
-      <w:hyperlink r:id="rId138">
+      <w:hyperlink r:id="rId143">
         <w:r>
           <w:rPr>
             <w:rStyle w:val="Hyperlink"/>
@@ -3349,8 +3441,8 @@
         <w:t xml:space="preserve">.</w:t>
       </w:r>
     </w:p>
-    <w:bookmarkEnd w:id="139"/>
-    <w:bookmarkStart w:id="141" w:name="ref-mcroberts_2011"/>
+    <w:bookmarkEnd w:id="144"/>
+    <w:bookmarkStart w:id="146" w:name="ref-mcroberts_2011"/>
     <w:p>
       <w:pPr>
         <w:pStyle w:val="Bibliography"/>
@@ -3395,7 +3487,7 @@
       <w:r>
         <w:t xml:space="preserve"> </w:t>
       </w:r>
-      <w:hyperlink r:id="rId140">
+      <w:hyperlink r:id="rId145">
         <w:r>
           <w:rPr>
             <w:rStyle w:val="Hyperlink"/>
@@ -3407,8 +3499,8 @@
         <w:t xml:space="preserve">.</w:t>
       </w:r>
     </w:p>
-    <w:bookmarkEnd w:id="141"/>
-    <w:bookmarkStart w:id="143" w:name="ref-oiry_discriminating_2024"/>
+    <w:bookmarkEnd w:id="146"/>
+    <w:bookmarkStart w:id="148" w:name="ref-oiry_discriminating_2024"/>
     <w:p>
       <w:pPr>
         <w:pStyle w:val="Bibliography"/>
@@ -3528,7 +3620,7 @@
       <w:r>
         <w:t xml:space="preserve"> </w:t>
       </w:r>
-      <w:hyperlink r:id="rId142">
+      <w:hyperlink r:id="rId147">
         <w:r>
           <w:rPr>
             <w:rStyle w:val="Hyperlink"/>
@@ -3540,29 +3632,20 @@
         <w:t xml:space="preserve">.</w:t>
       </w:r>
     </w:p>
-    <w:bookmarkEnd w:id="143"/>
-    <w:bookmarkStart w:id="145" w:name="ref-poursanidis_use_2019"/>
+    <w:bookmarkEnd w:id="148"/>
+    <w:bookmarkStart w:id="150" w:name="ref-olofsson_good_2014"/>
     <w:p>
       <w:pPr>
         <w:pStyle w:val="Bibliography"/>
       </w:pPr>
       <w:r>
-        <w:t xml:space="preserve">Poursanidis, Dimitris, Dimosthenis Traganos, Peter Reinartz, and Nektarios Chrysoulakis. 2019.</w:t>
-      </w:r>
-      <w:r>
-        <w:t xml:space="preserve"> </w:t>
-      </w:r>
-      <w:r>
-        <w:t xml:space="preserve">“On the Use of</w:t>
-      </w:r>
-      <w:r>
-        <w:t xml:space="preserve"> </w:t>
-      </w:r>
-      <w:r>
-        <w:t xml:space="preserve">Sentinel</w:t>
-      </w:r>
-      <w:r>
-        <w:t xml:space="preserve">-2 for Coastal Habitat Mapping and Satellite-Derived Bathymetry Estimation Using Downscaled Coastal Aerosol Band.”</w:t>
+        <w:t xml:space="preserve">Olofsson, Pontus, Giles M. Foody, Martin Herold, Stephen V. Stehman, Curtis E. Woodcock, and Michael A. Wulder. 2014.</w:t>
+      </w:r>
+      <w:r>
+        <w:t xml:space="preserve"> </w:t>
+      </w:r>
+      <w:r>
+        <w:t xml:space="preserve">“Good Practices for Estimating Area and Assessing Accuracy of Land Change.”</w:t>
       </w:r>
       <w:r>
         <w:t xml:space="preserve"> </w:t>
@@ -3572,6 +3655,61 @@
           <w:i/>
           <w:iCs/>
         </w:rPr>
+        <w:t xml:space="preserve">Remote Sensing of Environment</w:t>
+      </w:r>
+      <w:r>
+        <w:t xml:space="preserve"> </w:t>
+      </w:r>
+      <w:r>
+        <w:t xml:space="preserve">148 (May): 42–57.</w:t>
+      </w:r>
+      <w:r>
+        <w:t xml:space="preserve"> </w:t>
+      </w:r>
+      <w:hyperlink r:id="rId149">
+        <w:r>
+          <w:rPr>
+            <w:rStyle w:val="Hyperlink"/>
+          </w:rPr>
+          <w:t xml:space="preserve">https://doi.org/10.1016/j.rse.2014.02.015</w:t>
+        </w:r>
+      </w:hyperlink>
+      <w:r>
+        <w:t xml:space="preserve">.</w:t>
+      </w:r>
+    </w:p>
+    <w:bookmarkEnd w:id="150"/>
+    <w:bookmarkStart w:id="152" w:name="ref-poursanidis_use_2019"/>
+    <w:p>
+      <w:pPr>
+        <w:pStyle w:val="Bibliography"/>
+      </w:pPr>
+      <w:r>
+        <w:t xml:space="preserve">Poursanidis, Dimitris, Dimosthenis Traganos, Peter Reinartz, and Nektarios Chrysoulakis. 2019.</w:t>
+      </w:r>
+      <w:r>
+        <w:t xml:space="preserve"> </w:t>
+      </w:r>
+      <w:r>
+        <w:t xml:space="preserve">“On the Use of</w:t>
+      </w:r>
+      <w:r>
+        <w:t xml:space="preserve"> </w:t>
+      </w:r>
+      <w:r>
+        <w:t xml:space="preserve">Sentinel</w:t>
+      </w:r>
+      <w:r>
+        <w:t xml:space="preserve">-2 for Coastal Habitat Mapping and Satellite-Derived Bathymetry Estimation Using Downscaled Coastal Aerosol Band.”</w:t>
+      </w:r>
+      <w:r>
+        <w:t xml:space="preserve"> </w:t>
+      </w:r>
+      <w:r>
+        <w:rPr>
+          <w:i/>
+          <w:iCs/>
+        </w:rPr>
         <w:t xml:space="preserve">International Journal of Applied Earth Observation and Geoinformation</w:t>
       </w:r>
       <w:r>
@@ -3583,7 +3721,7 @@
       <w:r>
         <w:t xml:space="preserve"> </w:t>
       </w:r>
-      <w:hyperlink r:id="rId144">
+      <w:hyperlink r:id="rId151">
         <w:r>
           <w:rPr>
             <w:rStyle w:val="Hyperlink"/>
@@ -3595,8 +3733,8 @@
         <w:t xml:space="preserve">.</w:t>
       </w:r>
     </w:p>
-    <w:bookmarkEnd w:id="145"/>
-    <w:bookmarkStart w:id="147" w:name="ref-traganos_spatially_2022"/>
+    <w:bookmarkEnd w:id="152"/>
+    <w:bookmarkStart w:id="154" w:name="ref-traganos_spatially_2022"/>
     <w:p>
       <w:pPr>
         <w:pStyle w:val="Bibliography"/>
@@ -3680,7 +3818,7 @@
       <w:r>
         <w:t xml:space="preserve"> </w:t>
       </w:r>
-      <w:hyperlink r:id="rId146">
+      <w:hyperlink r:id="rId153">
         <w:r>
           <w:rPr>
             <w:rStyle w:val="Hyperlink"/>
@@ -3692,8 +3830,8 @@
         <w:t xml:space="preserve">.</w:t>
       </w:r>
     </w:p>
-    <w:bookmarkEnd w:id="147"/>
-    <w:bookmarkStart w:id="149" w:name="ref-traganos_mapping_2018"/>
+    <w:bookmarkEnd w:id="154"/>
+    <w:bookmarkStart w:id="156" w:name="ref-traganos_mapping_2018"/>
     <w:p>
       <w:pPr>
         <w:pStyle w:val="Bibliography"/>
@@ -3747,7 +3885,7 @@
       <w:r>
         <w:t xml:space="preserve"> </w:t>
       </w:r>
-      <w:hyperlink r:id="rId148">
+      <w:hyperlink r:id="rId155">
         <w:r>
           <w:rPr>
             <w:rStyle w:val="Hyperlink"/>
@@ -3759,8 +3897,8 @@
         <w:t xml:space="preserve">.</w:t>
       </w:r>
     </w:p>
-    <w:bookmarkEnd w:id="149"/>
-    <w:bookmarkStart w:id="151" w:name="ref-zoffoli_decadal_2021"/>
+    <w:bookmarkEnd w:id="156"/>
+    <w:bookmarkStart w:id="158" w:name="ref-zoffoli_decadal_2021"/>
     <w:p>
       <w:pPr>
         <w:pStyle w:val="Bibliography"/>
@@ -3811,7 +3949,7 @@
       <w:r>
         <w:t xml:space="preserve"> </w:t>
       </w:r>
-      <w:hyperlink r:id="rId150">
+      <w:hyperlink r:id="rId157">
         <w:r>
           <w:rPr>
             <w:rStyle w:val="Hyperlink"/>
@@ -3823,8 +3961,8 @@
         <w:t xml:space="preserve">.</w:t>
       </w:r>
     </w:p>
-    <w:bookmarkEnd w:id="151"/>
-    <w:bookmarkStart w:id="153" w:name="ref-zoffoli_remote_2022"/>
+    <w:bookmarkEnd w:id="158"/>
+    <w:bookmarkStart w:id="160" w:name="ref-zoffoli_remote_2022"/>
     <w:p>
       <w:pPr>
         <w:pStyle w:val="Bibliography"/>
@@ -3860,7 +3998,7 @@
       <w:r>
         <w:t xml:space="preserve"> </w:t>
       </w:r>
-      <w:hyperlink r:id="rId152">
+      <w:hyperlink r:id="rId159">
         <w:r>
           <w:rPr>
             <w:rStyle w:val="Hyperlink"/>
@@ -3872,8 +4010,8 @@
         <w:t xml:space="preserve">.</w:t>
       </w:r>
     </w:p>
-    <w:bookmarkEnd w:id="153"/>
-    <w:bookmarkStart w:id="155" w:name="ref-zoffoli_sentinel-2_2020"/>
+    <w:bookmarkEnd w:id="160"/>
+    <w:bookmarkStart w:id="162" w:name="ref-zoffoli_sentinel-2_2020"/>
     <w:p>
       <w:pPr>
         <w:pStyle w:val="Bibliography"/>
@@ -3918,7 +4056,7 @@
       <w:r>
         <w:t xml:space="preserve"> </w:t>
       </w:r>
-      <w:hyperlink r:id="rId154">
+      <w:hyperlink r:id="rId161">
         <w:r>
           <w:rPr>
             <w:rStyle w:val="Hyperlink"/>
@@ -3930,9 +4068,9 @@
         <w:t xml:space="preserve">.</w:t>
       </w:r>
     </w:p>
-    <w:bookmarkEnd w:id="155"/>
-    <w:bookmarkEnd w:id="156"/>
-    <w:bookmarkEnd w:id="157"/>
+    <w:bookmarkEnd w:id="162"/>
+    <w:bookmarkEnd w:id="163"/>
+    <w:bookmarkEnd w:id="164"/>
     <w:sectPr>
       <w:footnotePr>
         <w:numRestart w:val="eachSect"/>

</xml_diff>